<commit_message>
fix(templates): drop markdown bold markers from vacation meal placeholders
Word templates should show plain 午餐/晚餐 (Lunch/Dinner) labels, not leftover ** from markdown.
</commit_message>
<xml_diff>
--- a/templates/en/vacation.docx
+++ b/templates/en/vacation.docx
@@ -73,15 +73,28 @@
     </w:p>
     <w:p>
       <w:pPr>
-        <w:spacing w:after="120" w:lineRule="auto" w:line="300"/>
+        <w:spacing w:after="80" w:lineRule="auto" w:line="300"/>
       </w:pPr>
       <w:r>
         <w:rPr>
           <w:rFonts w:ascii="Helvetica Neue" w:hAnsi="Helvetica Neue" w:eastAsia="PingFang SC"/>
-          <w:b w:val="0"/>
+          <w:b/>
           <w:sz w:val="21"/>
         </w:rPr>
-        <w:t>Departure point (hh:mm) – Arrival point (hh:mm)</w:t>
+        <w:t xml:space="preserve">Lunch: </w:t>
+      </w:r>
+    </w:p>
+    <w:p>
+      <w:pPr>
+        <w:spacing w:after="80" w:lineRule="auto" w:line="300"/>
+      </w:pPr>
+      <w:r>
+        <w:rPr>
+          <w:rFonts w:ascii="Helvetica Neue" w:hAnsi="Helvetica Neue" w:eastAsia="PingFang SC"/>
+          <w:b/>
+          <w:sz w:val="21"/>
+        </w:rPr>
+        <w:t xml:space="preserve">Dinner: </w:t>
       </w:r>
     </w:p>
     <w:p>
@@ -94,20 +107,7 @@
           <w:b w:val="0"/>
           <w:sz w:val="21"/>
         </w:rPr>
-        <w:t>**Lunch:</w:t>
-      </w:r>
-    </w:p>
-    <w:p>
-      <w:pPr>
-        <w:spacing w:after="120" w:lineRule="auto" w:line="300"/>
-      </w:pPr>
-      <w:r>
-        <w:rPr>
-          <w:rFonts w:ascii="Helvetica Neue" w:hAnsi="Helvetica Neue" w:eastAsia="PingFang SC"/>
-          <w:b w:val="0"/>
-          <w:sz w:val="21"/>
-        </w:rPr>
-        <w:t>Dinner:**</w:t>
+        <w:t>Departure point (hh:mm) – Arrival point (hh:mm)</w:t>
       </w:r>
     </w:p>
     <w:p>
@@ -139,28 +139,28 @@
     </w:p>
     <w:p>
       <w:pPr>
-        <w:spacing w:after="120" w:lineRule="auto" w:line="300"/>
+        <w:spacing w:after="80" w:lineRule="auto" w:line="300"/>
       </w:pPr>
       <w:r>
         <w:rPr>
           <w:rFonts w:ascii="Helvetica Neue" w:hAnsi="Helvetica Neue" w:eastAsia="PingFang SC"/>
-          <w:b w:val="0"/>
+          <w:b/>
           <w:sz w:val="21"/>
         </w:rPr>
-        <w:t>**Lunch:</w:t>
+        <w:t xml:space="preserve">Lunch: </w:t>
       </w:r>
     </w:p>
     <w:p>
       <w:pPr>
-        <w:spacing w:after="120" w:lineRule="auto" w:line="300"/>
+        <w:spacing w:after="80" w:lineRule="auto" w:line="300"/>
       </w:pPr>
       <w:r>
         <w:rPr>
           <w:rFonts w:ascii="Helvetica Neue" w:hAnsi="Helvetica Neue" w:eastAsia="PingFang SC"/>
-          <w:b w:val="0"/>
+          <w:b/>
           <w:sz w:val="21"/>
         </w:rPr>
-        <w:t>Dinner:**</w:t>
+        <w:t xml:space="preserve">Dinner: </w:t>
       </w:r>
     </w:p>
     <w:p>
@@ -192,28 +192,28 @@
     </w:p>
     <w:p>
       <w:pPr>
-        <w:spacing w:after="120" w:lineRule="auto" w:line="300"/>
+        <w:spacing w:after="80" w:lineRule="auto" w:line="300"/>
       </w:pPr>
       <w:r>
         <w:rPr>
           <w:rFonts w:ascii="Helvetica Neue" w:hAnsi="Helvetica Neue" w:eastAsia="PingFang SC"/>
-          <w:b w:val="0"/>
+          <w:b/>
           <w:sz w:val="21"/>
         </w:rPr>
-        <w:t>**Lunch:</w:t>
+        <w:t xml:space="preserve">Lunch: </w:t>
       </w:r>
     </w:p>
     <w:p>
       <w:pPr>
-        <w:spacing w:after="120" w:lineRule="auto" w:line="300"/>
+        <w:spacing w:after="80" w:lineRule="auto" w:line="300"/>
       </w:pPr>
       <w:r>
         <w:rPr>
           <w:rFonts w:ascii="Helvetica Neue" w:hAnsi="Helvetica Neue" w:eastAsia="PingFang SC"/>
-          <w:b w:val="0"/>
+          <w:b/>
           <w:sz w:val="21"/>
         </w:rPr>
-        <w:t>Dinner:**</w:t>
+        <w:t xml:space="preserve">Dinner: </w:t>
       </w:r>
     </w:p>
     <w:p>
@@ -245,28 +245,28 @@
     </w:p>
     <w:p>
       <w:pPr>
-        <w:spacing w:after="120" w:lineRule="auto" w:line="300"/>
+        <w:spacing w:after="80" w:lineRule="auto" w:line="300"/>
       </w:pPr>
       <w:r>
         <w:rPr>
           <w:rFonts w:ascii="Helvetica Neue" w:hAnsi="Helvetica Neue" w:eastAsia="PingFang SC"/>
-          <w:b w:val="0"/>
+          <w:b/>
           <w:sz w:val="21"/>
         </w:rPr>
-        <w:t>**Lunch:</w:t>
+        <w:t xml:space="preserve">Lunch: </w:t>
       </w:r>
     </w:p>
     <w:p>
       <w:pPr>
-        <w:spacing w:after="120" w:lineRule="auto" w:line="300"/>
+        <w:spacing w:after="80" w:lineRule="auto" w:line="300"/>
       </w:pPr>
       <w:r>
         <w:rPr>
           <w:rFonts w:ascii="Helvetica Neue" w:hAnsi="Helvetica Neue" w:eastAsia="PingFang SC"/>
-          <w:b w:val="0"/>
+          <w:b/>
           <w:sz w:val="21"/>
         </w:rPr>
-        <w:t>Dinner:**</w:t>
+        <w:t xml:space="preserve">Dinner: </w:t>
       </w:r>
     </w:p>
     <w:p>

</xml_diff>